<commit_message>
Polish portfolio resume content
</commit_message>
<xml_diff>
--- a/assets/tangle-resume.docx
+++ b/assets/tangle-resume.docx
@@ -4,14 +4,11 @@
   <w:body>
     <w:p>
       <w:pPr>
-        <w:spacing w:after="20"/>
         <w:jc w:val="center"/>
       </w:pPr>
       <w:r>
         <w:rPr>
-          <w:rFonts w:ascii="Microsoft YaHei" w:hAnsi="Microsoft YaHei" w:eastAsia="Microsoft YaHei"/>
           <w:b/>
-          <w:color w:val="111827"/>
           <w:sz w:val="40"/>
         </w:rPr>
         <w:t>唐乐</w:t>
@@ -19,211 +16,55 @@
     </w:p>
     <w:p>
       <w:pPr>
-        <w:spacing w:after="0"/>
         <w:jc w:val="center"/>
       </w:pPr>
       <w:r>
         <w:rPr>
-          <w:rFonts w:ascii="Microsoft YaHei" w:hAnsi="Microsoft YaHei" w:eastAsia="Microsoft YaHei"/>
-          <w:b w:val="0"/>
-          <w:color w:val="374151"/>
-          <w:sz w:val="18"/>
+          <w:sz w:val="20"/>
         </w:rPr>
-        <w:t>软件开发工程师 / Java 开发 / Python 开发 / 微信小程序开发</w:t>
+        <w:t>软件开发工程师方向 / 前端实现 / Python · Java / 微信小程序</w:t>
       </w:r>
     </w:p>
     <w:p>
       <w:pPr>
-        <w:spacing w:after="0"/>
         <w:jc w:val="center"/>
       </w:pPr>
       <w:r>
         <w:rPr>
-          <w:rFonts w:ascii="Microsoft YaHei" w:hAnsi="Microsoft YaHei" w:eastAsia="Microsoft YaHei"/>
-          <w:b w:val="0"/>
-          <w:color w:val="4B5563"/>
-          <w:sz w:val="17"/>
+          <w:sz w:val="18"/>
         </w:rPr>
-        <w:t>18064871268 | 2061790875@qq.com | 云南昆明</w:t>
+        <w:t>电话：18064871268  |  邮箱：2061790875@qq.com  |  GitHub：github.com/tl66666</w:t>
       </w:r>
     </w:p>
     <w:p>
       <w:pPr>
-        <w:spacing w:after="0"/>
-        <w:jc w:val="center"/>
+        <w:spacing w:before="100" w:after="40"/>
       </w:pPr>
       <w:r>
         <w:rPr>
-          <w:rFonts w:ascii="Microsoft YaHei" w:hAnsi="Microsoft YaHei" w:eastAsia="Microsoft YaHei"/>
-          <w:b w:val="0"/>
-          <w:color w:val="B45309"/>
-          <w:sz w:val="17"/>
+          <w:b/>
+          <w:color w:val="212121"/>
+          <w:sz w:val="22"/>
         </w:rPr>
-        <w:t>上海应用技术大学 · 软件工程本科 · 2023.10-2027.06 | CET-6 | 入党积极分子</w:t>
+        <w:t>个人优势</w:t>
+      </w:r>
+    </w:p>
+    <w:p>
+      <w:r>
+        <w:t>软件工程本科在读，通过 CET-6，熟悉 Java、Python、C/C++、JavaScript、Flask、MySQL/SQLite 与微信小程序开发。熟练使用 vibe coding 工作流推进项目：能把需求描述拆解为页面、接口、数据结构和测试点，借助 Codex、Claude Code、Trae 等 AI 工具快速生成初版，再通过代码阅读、调试排错、功能补齐和文档整理完成交付。已独立完成 AI 求职 Web 系统、星球自律小程序、城市照片手账小程序等完整作品。</w:t>
       </w:r>
     </w:p>
     <w:p>
       <w:pPr>
-        <w:spacing w:before="80" w:after="40"/>
-        <w:pBdr>
-          <w:bottom w:val="single" w:sz="6" w:space="2" w:color="D7DEE8"/>
-        </w:pBdr>
+        <w:spacing w:before="100" w:after="40"/>
       </w:pPr>
       <w:r>
         <w:rPr>
-          <w:rFonts w:ascii="Microsoft YaHei" w:hAnsi="Microsoft YaHei" w:eastAsia="Microsoft YaHei"/>
           <w:b/>
-          <w:color w:val="1D4ED8"/>
+          <w:color w:val="212121"/>
           <w:sz w:val="22"/>
         </w:rPr>
-        <w:t>教育背景</w:t>
-      </w:r>
-    </w:p>
-    <w:p>
-      <w:pPr>
-        <w:spacing w:after="20" w:line="252" w:lineRule="auto"/>
-      </w:pPr>
-      <w:r>
-        <w:rPr>
-          <w:rFonts w:ascii="Microsoft YaHei" w:hAnsi="Microsoft YaHei" w:eastAsia="Microsoft YaHei"/>
-          <w:b/>
-          <w:color w:val="1F2937"/>
-          <w:sz w:val="17"/>
-        </w:rPr>
-        <w:t>上海应用技术大学　软件工程　本科　2023.10 - 2027.06</w:t>
-      </w:r>
-    </w:p>
-    <w:p>
-      <w:pPr>
-        <w:spacing w:before="80" w:after="40"/>
-        <w:pBdr>
-          <w:bottom w:val="single" w:sz="6" w:space="2" w:color="D7DEE8"/>
-        </w:pBdr>
-      </w:pPr>
-      <w:r>
-        <w:rPr>
-          <w:rFonts w:ascii="Microsoft YaHei" w:hAnsi="Microsoft YaHei" w:eastAsia="Microsoft YaHei"/>
-          <w:b/>
-          <w:color w:val="1D4ED8"/>
-          <w:sz w:val="22"/>
-        </w:rPr>
-        <w:t>技术能力</w:t>
-      </w:r>
-    </w:p>
-    <w:tbl>
-      <w:tblPr>
-        <w:tblW w:type="auto" w:w="0"/>
-        <w:tblLayout w:type="autofit"/>
-        <w:tblLook w:firstColumn="1" w:firstRow="1" w:lastColumn="0" w:lastRow="0" w:noHBand="0" w:noVBand="1" w:val="04A0"/>
-      </w:tblPr>
-      <w:tblGrid>
-        <w:gridCol w:w="5244"/>
-        <w:gridCol w:w="5244"/>
-      </w:tblGrid>
-      <w:tr>
-        <w:tc>
-          <w:tcPr>
-            <w:tcW w:type="dxa" w:w="5244"/>
-            <w:shd w:fill="F7FAFC"/>
-          </w:tcPr>
-          <w:p>
-            <w:pPr>
-              <w:spacing w:after="0"/>
-            </w:pPr>
-            <w:r/>
-            <w:r>
-              <w:rPr>
-                <w:rFonts w:ascii="Microsoft YaHei" w:hAnsi="Microsoft YaHei" w:eastAsia="Microsoft YaHei"/>
-                <w:b w:val="0"/>
-                <w:color w:val="1F2937"/>
-                <w:sz w:val="16"/>
-              </w:rPr>
-              <w:t>编程语言：Java、Python、C++、JavaScript、HTML/CSS</w:t>
-            </w:r>
-          </w:p>
-        </w:tc>
-        <w:tc>
-          <w:tcPr>
-            <w:tcW w:type="dxa" w:w="5244"/>
-            <w:shd w:fill="F7FAFC"/>
-          </w:tcPr>
-          <w:p>
-            <w:pPr>
-              <w:spacing w:after="0"/>
-            </w:pPr>
-            <w:r/>
-            <w:r>
-              <w:rPr>
-                <w:rFonts w:ascii="Microsoft YaHei" w:hAnsi="Microsoft YaHei" w:eastAsia="Microsoft YaHei"/>
-                <w:b w:val="0"/>
-                <w:color w:val="1F2937"/>
-                <w:sz w:val="16"/>
-              </w:rPr>
-              <w:t>数据库与后端：MySQL、数据库表设计、CRUD、基础查询优化</w:t>
-            </w:r>
-          </w:p>
-        </w:tc>
-      </w:tr>
-      <w:tr>
-        <w:tc>
-          <w:tcPr>
-            <w:tcW w:type="dxa" w:w="5244"/>
-            <w:shd w:fill="F7FAFC"/>
-          </w:tcPr>
-          <w:p>
-            <w:pPr>
-              <w:spacing w:after="0"/>
-            </w:pPr>
-            <w:r/>
-            <w:r>
-              <w:rPr>
-                <w:rFonts w:ascii="Microsoft YaHei" w:hAnsi="Microsoft YaHei" w:eastAsia="Microsoft YaHei"/>
-                <w:b w:val="0"/>
-                <w:color w:val="1F2937"/>
-                <w:sz w:val="16"/>
-              </w:rPr>
-              <w:t>小程序与前端：微信小程序原生开发、WXML、WXSS、页面交互实现</w:t>
-            </w:r>
-          </w:p>
-        </w:tc>
-        <w:tc>
-          <w:tcPr>
-            <w:tcW w:type="dxa" w:w="5244"/>
-            <w:shd w:fill="F7FAFC"/>
-          </w:tcPr>
-          <w:p>
-            <w:pPr>
-              <w:spacing w:after="0"/>
-            </w:pPr>
-            <w:r/>
-            <w:r>
-              <w:rPr>
-                <w:rFonts w:ascii="Microsoft YaHei" w:hAnsi="Microsoft YaHei" w:eastAsia="Microsoft YaHei"/>
-                <w:b w:val="0"/>
-                <w:color w:val="1F2937"/>
-                <w:sz w:val="16"/>
-              </w:rPr>
-              <w:t>工程工具：GitHub、微信开发者工具、微信云开发、Node.js Test Runner</w:t>
-            </w:r>
-          </w:p>
-        </w:tc>
-      </w:tr>
-    </w:tbl>
-    <w:p>
-      <w:pPr>
-        <w:spacing w:before="80" w:after="40"/>
-        <w:pBdr>
-          <w:bottom w:val="single" w:sz="6" w:space="2" w:color="D7DEE8"/>
-        </w:pBdr>
-      </w:pPr>
-      <w:r>
-        <w:rPr>
-          <w:rFonts w:ascii="Microsoft YaHei" w:hAnsi="Microsoft YaHei" w:eastAsia="Microsoft YaHei"/>
-          <w:b/>
-          <w:color w:val="1D4ED8"/>
-          <w:sz w:val="22"/>
-        </w:rPr>
-        <w:t>项目经历</w:t>
+        <w:t>技能栈</w:t>
       </w:r>
     </w:p>
     <w:p>
@@ -232,194 +73,312 @@
       </w:pPr>
       <w:r>
         <w:rPr>
-          <w:rFonts w:ascii="Microsoft YaHei" w:hAnsi="Microsoft YaHei" w:eastAsia="Microsoft YaHei"/>
           <w:b/>
-          <w:color w:val="111827"/>
-          <w:sz w:val="18"/>
+        </w:rPr>
+        <w:t>编程与基础：</w:t>
+      </w:r>
+      <w:r>
+        <w:t>Java、Python、C/C++、JavaScript、HTML/CSS、SQL、HTTP、文件处理、基础数据结构</w:t>
+      </w:r>
+    </w:p>
+    <w:p>
+      <w:pPr>
+        <w:spacing w:after="20"/>
+      </w:pPr>
+      <w:r>
+        <w:rPr>
+          <w:b/>
+        </w:rPr>
+        <w:t>后端与数据：</w:t>
+      </w:r>
+      <w:r>
+        <w:t>Flask、SQLite、MySQL、Requests、PDF/Word 解析与导出、文件上传、接口联调、数据持久化</w:t>
+      </w:r>
+    </w:p>
+    <w:p>
+      <w:pPr>
+        <w:spacing w:after="20"/>
+      </w:pPr>
+      <w:r>
+        <w:rPr>
+          <w:b/>
+        </w:rPr>
+        <w:t>前端与小程序：</w:t>
+      </w:r>
+      <w:r>
+        <w:t>Vue、Chart.js、响应式页面、动效表达、WXML/WXSS、微信云开发、云函数、云数据库、云存储</w:t>
+      </w:r>
+    </w:p>
+    <w:p>
+      <w:pPr>
+        <w:spacing w:after="20"/>
+      </w:pPr>
+      <w:r>
+        <w:rPr>
+          <w:b/>
+        </w:rPr>
+        <w:t>AI 协作开发：</w:t>
+      </w:r>
+      <w:r>
+        <w:t>Vibe coding 工作流、需求拆解、Prompt 迭代、AI 辅助生成页面/接口、代码调试、错误修复、文档沉淀</w:t>
+      </w:r>
+    </w:p>
+    <w:p>
+      <w:pPr>
+        <w:spacing w:before="100" w:after="40"/>
+      </w:pPr>
+      <w:r>
+        <w:rPr>
+          <w:b/>
+          <w:color w:val="212121"/>
+          <w:sz w:val="22"/>
+        </w:rPr>
+        <w:t>项目经历</w:t>
+      </w:r>
+    </w:p>
+    <w:p>
+      <w:pPr>
+        <w:spacing w:before="60" w:after="20"/>
+      </w:pPr>
+      <w:r>
+        <w:rPr>
+          <w:b/>
+        </w:rPr>
+        <w:t>职途 AI - AI Agent 求职辅助 Web 系统</w:t>
+      </w:r>
+      <w:r>
+        <w:t xml:space="preserve"> | Python / Flask / SQLite / JavaScript / Chart.js / GLM · DeepSeek · Kimi / MediaRecorder</w:t>
+      </w:r>
+    </w:p>
+    <w:p>
+      <w:pPr>
+        <w:spacing w:after="20"/>
+        <w:ind w:left="142" w:hanging="142"/>
+      </w:pPr>
+      <w:r>
+        <w:rPr>
+          <w:b/>
+        </w:rPr>
+        <w:t xml:space="preserve">• </w:t>
+      </w:r>
+      <w:r>
+        <w:t>痛点：求职材料、岗位 JD、模拟面试和投递进度分散，用户很难形成连续的求职准备流程。</w:t>
+      </w:r>
+    </w:p>
+    <w:p>
+      <w:pPr>
+        <w:spacing w:after="20"/>
+        <w:ind w:left="142" w:hanging="142"/>
+      </w:pPr>
+      <w:r>
+        <w:rPr>
+          <w:b/>
+        </w:rPr>
+        <w:t xml:space="preserve">• </w:t>
+      </w:r>
+      <w:r>
+        <w:t>方案：设计“简历录入 - JD 解析 - 能力匹配 - 模拟面试 - 投递看板”的闭环，支持多模型切换与未配置 Key 时的本地规则兜底。</w:t>
+      </w:r>
+    </w:p>
+    <w:p>
+      <w:pPr>
+        <w:spacing w:after="20"/>
+        <w:ind w:left="142" w:hanging="142"/>
+      </w:pPr>
+      <w:r>
+        <w:rPr>
+          <w:b/>
+        </w:rPr>
+        <w:t xml:space="preserve">• </w:t>
+      </w:r>
+      <w:r>
+        <w:t>负责：完成 Flask 后端、SQLite 数据表、文件上传解析、AI 调用封装、前端仪表盘、技能图谱和面试记录管理。</w:t>
+      </w:r>
+    </w:p>
+    <w:p>
+      <w:pPr>
+        <w:spacing w:after="20"/>
+        <w:ind w:left="142" w:hanging="142"/>
+      </w:pPr>
+      <w:r>
+        <w:rPr>
+          <w:b/>
+        </w:rPr>
+        <w:t xml:space="preserve">• </w:t>
+      </w:r>
+      <w:r>
+        <w:t>亮点：支持 PDF/Word 简历解析、JD 关键词提取、岗位匹配建议、语音录制回放、面试问答复盘和投递状态追踪。</w:t>
+      </w:r>
+    </w:p>
+    <w:p>
+      <w:pPr>
+        <w:spacing w:before="60" w:after="20"/>
+      </w:pPr>
+      <w:r>
+        <w:rPr>
+          <w:b/>
         </w:rPr>
         <w:t>星途自律舱 - 星球养成式自律打卡微信小程序</w:t>
       </w:r>
       <w:r>
-        <w:rPr>
-          <w:rFonts w:ascii="Microsoft YaHei" w:hAnsi="Microsoft YaHei" w:eastAsia="Microsoft YaHei"/>
-          <w:b w:val="0"/>
-          <w:color w:val="6B7280"/>
-          <w:sz w:val="16"/>
-        </w:rPr>
-        <w:t xml:space="preserve">    2026.06</w:t>
+        <w:t xml:space="preserve"> | 微信原生小程序 / WXML / WXSS / JavaScript / 云开发 / 云数据库 / 云函数 / Node.js 测试脚本</w:t>
       </w:r>
     </w:p>
     <w:p>
       <w:pPr>
-        <w:spacing w:after="16" w:line="252" w:lineRule="auto"/>
-        <w:ind w:left="215" w:hanging="102"/>
+        <w:spacing w:after="20"/>
+        <w:ind w:left="142" w:hanging="142"/>
       </w:pPr>
       <w:r>
         <w:rPr>
-          <w:rFonts w:ascii="Microsoft YaHei" w:hAnsi="Microsoft YaHei" w:eastAsia="Microsoft YaHei"/>
-          <w:b w:val="0"/>
-          <w:color w:val="1F2937"/>
-          <w:sz w:val="16"/>
+          <w:b/>
         </w:rPr>
-        <w:t>- 独立完成需求拆解、页面设计与核心功能开发，围绕运动、饮食、学习、工作、计划、睡眠构建六维打卡体系。</w:t>
+        <w:t xml:space="preserve">• </w:t>
+      </w:r>
+      <w:r>
+        <w:t>痛点：传统待办工具反馈弱、坚持成本高，用户完成任务后缺少持续激励和成长感。</w:t>
       </w:r>
     </w:p>
     <w:p>
       <w:pPr>
-        <w:spacing w:after="16" w:line="252" w:lineRule="auto"/>
-        <w:ind w:left="215" w:hanging="102"/>
+        <w:spacing w:after="20"/>
+        <w:ind w:left="142" w:hanging="142"/>
       </w:pPr>
       <w:r>
         <w:rPr>
-          <w:rFonts w:ascii="Microsoft YaHei" w:hAnsi="Microsoft YaHei" w:eastAsia="Microsoft YaHei"/>
-          <w:b w:val="0"/>
-          <w:color w:val="1F2937"/>
-          <w:sz w:val="16"/>
+          <w:b/>
         </w:rPr>
-        <w:t>- 设计“目标设定 - 自定义计划 - 打卡反馈 - 星球成长”体验闭环，实现星光奖励、宝箱、成就墙、生态区入口和数据统计模块。</w:t>
+        <w:t xml:space="preserve">• </w:t>
+      </w:r>
+      <w:r>
+        <w:t>方案：把运动、饮食、学习、工作、计划、睡眠等任务转化为星球成长体系，用打卡、奖励、宝箱、成就和统计反馈强化正循环。</w:t>
       </w:r>
     </w:p>
     <w:p>
       <w:pPr>
-        <w:spacing w:after="16" w:line="252" w:lineRule="auto"/>
-        <w:ind w:left="215" w:hanging="102"/>
+        <w:spacing w:after="20"/>
+        <w:ind w:left="142" w:hanging="142"/>
       </w:pPr>
       <w:r>
         <w:rPr>
-          <w:rFonts w:ascii="Microsoft YaHei" w:hAnsi="Microsoft YaHei" w:eastAsia="Microsoft YaHei"/>
-          <w:b w:val="0"/>
-          <w:color w:val="1F2937"/>
-          <w:sz w:val="16"/>
+          <w:b/>
         </w:rPr>
-        <w:t>- 接入微信云开发，完成登录、打卡提交、统计读取、资料更新、数据导出、云资源链接等云函数与本地数据兜底逻辑。</w:t>
+        <w:t xml:space="preserve">• </w:t>
+      </w:r>
+      <w:r>
+        <w:t>负责：设计首页、任务、打卡、成就、数据统计和个人中心流程，完成云端数据同步、奖励计算、目标进度和异常状态处理。</w:t>
       </w:r>
     </w:p>
     <w:p>
       <w:pPr>
-        <w:spacing w:after="16" w:line="252" w:lineRule="auto"/>
-        <w:ind w:left="215" w:hanging="102"/>
+        <w:spacing w:after="20"/>
+        <w:ind w:left="142" w:hanging="142"/>
       </w:pPr>
       <w:r>
         <w:rPr>
-          <w:rFonts w:ascii="Microsoft YaHei" w:hAnsi="Microsoft YaHei" w:eastAsia="Microsoft YaHei"/>
-          <w:b w:val="0"/>
-          <w:color w:val="1F2937"/>
-          <w:sz w:val="16"/>
+          <w:b/>
         </w:rPr>
-        <w:t>- 处理小程序包体限制与资源加载问题，将大图、视频拆分至云存储，配合本地压缩素材、缓存策略和错误降级提示提升稳定性。</w:t>
+        <w:t xml:space="preserve">• </w:t>
+      </w:r>
+      <w:r>
+        <w:t>亮点：用测试脚本覆盖奖励计算、成就解锁和统计聚合等核心逻辑，保证小程序不仅能展示，也能稳定运行。</w:t>
       </w:r>
     </w:p>
     <w:p>
       <w:pPr>
-        <w:spacing w:after="16" w:line="252" w:lineRule="auto"/>
-        <w:ind w:left="215" w:hanging="102"/>
+        <w:spacing w:before="60" w:after="20"/>
       </w:pPr>
       <w:r>
         <w:rPr>
-          <w:rFonts w:ascii="Microsoft YaHei" w:hAnsi="Microsoft YaHei" w:eastAsia="Microsoft YaHei"/>
-          <w:b w:val="0"/>
-          <w:color w:val="1F2937"/>
-          <w:sz w:val="16"/>
+          <w:b/>
         </w:rPr>
-        <w:t>- 使用 Node.js Test Runner 覆盖奖励计算、目标进度、成就解锁和统计聚合等核心逻辑，减少手动调试成本。</w:t>
+        <w:t>城会玩 2.0 - 城市照片手账与旅行回忆归档小程序</w:t>
+      </w:r>
+      <w:r>
+        <w:t xml:space="preserve"> | 微信原生小程序 / WXML / WXSS / JavaScript / 微信云开发 / 云函数 / 云数据库 / 云存储 / 内容安全</w:t>
       </w:r>
     </w:p>
     <w:p>
       <w:pPr>
-        <w:spacing w:before="80" w:after="140"/>
+        <w:spacing w:after="20"/>
+        <w:ind w:left="142" w:hanging="142"/>
       </w:pPr>
       <w:r>
         <w:rPr>
-          <w:rFonts w:ascii="Microsoft YaHei" w:hAnsi="Microsoft YaHei" w:eastAsia="Microsoft YaHei"/>
-          <w:b w:val="0"/>
-          <w:color w:val="9CA3AF"/>
-          <w:sz w:val="16"/>
+          <w:b/>
         </w:rPr>
-        <w:t>下一项目经历预留：后续完成后可补充项目名称、技术栈、职责与成果。</w:t>
+        <w:t xml:space="preserve">• </w:t>
+      </w:r>
+      <w:r>
+        <w:t>痛点：旅行后照片散落在系统相册里，想找某座城市拍过的美景、美食和记录时，只能按时间反复翻找。</w:t>
       </w:r>
     </w:p>
     <w:p>
       <w:pPr>
-        <w:spacing w:before="80" w:after="40"/>
-        <w:pBdr>
-          <w:bottom w:val="single" w:sz="6" w:space="2" w:color="D7DEE8"/>
-        </w:pBdr>
+        <w:spacing w:after="20"/>
+        <w:ind w:left="142" w:hanging="142"/>
       </w:pPr>
       <w:r>
         <w:rPr>
-          <w:rFonts w:ascii="Microsoft YaHei" w:hAnsi="Microsoft YaHei" w:eastAsia="Microsoft YaHei"/>
           <w:b/>
-          <w:color w:val="1D4ED8"/>
-          <w:sz w:val="22"/>
         </w:rPr>
-        <w:t>实践经历</w:t>
+        <w:t xml:space="preserve">• </w:t>
+      </w:r>
+      <w:r>
+        <w:t>方案：以“城市”为照片容器，用户点亮城市后可上传旅行/美食照片和笔记，后续在城市详情、相册和动态中按地点快速找回。</w:t>
       </w:r>
     </w:p>
     <w:p>
       <w:pPr>
-        <w:spacing w:after="16" w:line="252" w:lineRule="auto"/>
-        <w:ind w:left="215" w:hanging="102"/>
+        <w:spacing w:after="20"/>
+        <w:ind w:left="142" w:hanging="142"/>
       </w:pPr>
       <w:r>
         <w:rPr>
-          <w:rFonts w:ascii="Microsoft YaHei" w:hAnsi="Microsoft YaHei" w:eastAsia="Microsoft YaHei"/>
-          <w:b w:val="0"/>
-          <w:color w:val="1F2937"/>
-          <w:sz w:val="15"/>
+          <w:b/>
         </w:rPr>
-        <w:t>- 校园运动会志愿服务：负责检录、赛道引导、物资分发和成绩登记协助，提升现场执行与沟通能力。</w:t>
+        <w:t xml:space="preserve">• </w:t>
+      </w:r>
+      <w:r>
+        <w:t>负责：完成地图点亮、城市详情、照片上传归档、相册筛选、动态记录、群组共享、成就反馈和小程序码展示等核心模块。</w:t>
       </w:r>
     </w:p>
     <w:p>
       <w:pPr>
-        <w:spacing w:after="16" w:line="252" w:lineRule="auto"/>
-        <w:ind w:left="215" w:hanging="102"/>
+        <w:spacing w:after="20"/>
+        <w:ind w:left="142" w:hanging="142"/>
       </w:pPr>
       <w:r>
         <w:rPr>
-          <w:rFonts w:ascii="Microsoft YaHei" w:hAnsi="Microsoft YaHei" w:eastAsia="Microsoft YaHei"/>
-          <w:b w:val="0"/>
-          <w:color w:val="1F2937"/>
-          <w:sz w:val="15"/>
+          <w:b/>
         </w:rPr>
-        <w:t>- 社区电脑维修公益服务：为居民提供系统调试、软件安装、网络故障排查等技术支持，增强动手排障能力。</w:t>
+        <w:t xml:space="preserve">• </w:t>
+      </w:r>
+      <w:r>
+        <w:t>亮点：将角色卡、徽章和群组作为辅助激励层，服务于“按城市沉淀旅行记忆”的主线，而不是只做打卡或抽卡展示。</w:t>
       </w:r>
     </w:p>
     <w:p>
       <w:pPr>
-        <w:spacing w:before="80" w:after="40"/>
-        <w:pBdr>
-          <w:bottom w:val="single" w:sz="6" w:space="2" w:color="D7DEE8"/>
-        </w:pBdr>
+        <w:spacing w:before="100" w:after="40"/>
       </w:pPr>
       <w:r>
         <w:rPr>
-          <w:rFonts w:ascii="Microsoft YaHei" w:hAnsi="Microsoft YaHei" w:eastAsia="Microsoft YaHei"/>
           <w:b/>
-          <w:color w:val="1D4ED8"/>
+          <w:color w:val="212121"/>
           <w:sz w:val="22"/>
         </w:rPr>
-        <w:t>自我评价</w:t>
+        <w:t>教育经历</w:t>
       </w:r>
     </w:p>
     <w:p>
-      <w:pPr>
-        <w:spacing w:after="16" w:line="252" w:lineRule="auto"/>
-        <w:ind w:left="215" w:hanging="102"/>
-      </w:pPr>
       <w:r>
-        <w:rPr>
-          <w:rFonts w:ascii="Microsoft YaHei" w:hAnsi="Microsoft YaHei" w:eastAsia="Microsoft YaHei"/>
-          <w:b w:val="0"/>
-          <w:color w:val="1F2937"/>
-          <w:sz w:val="16"/>
-        </w:rPr>
-        <w:t>- 软件工程专业基础较扎实，具备 Java、Python、MySQL 和微信小程序开发实践；能独立推进小型项目从需求拆解到开发测试落地。学习能力强，责任心较好，希望在真实项目中继续积累工程经验。</w:t>
+        <w:t>上海应用技术大学 · 软件工程 本科（2023.10 至今） | CET-6</w:t>
       </w:r>
     </w:p>
     <w:sectPr>
-      <w:pgSz w:w="11906" w:h="16838"/>
-      <w:pgMar w:top="595" w:right="709" w:bottom="567" w:left="709" w:header="720" w:footer="720" w:gutter="0"/>
+      <w:pgSz w:w="12240" w:h="15840"/>
+      <w:pgMar w:top="680" w:right="850" w:bottom="680" w:left="850" w:header="720" w:footer="720" w:gutter="0"/>
       <w:cols w:space="720"/>
       <w:docGrid w:linePitch="360"/>
     </w:sectPr>
@@ -791,8 +750,8 @@
     <w:qFormat/>
     <w:rsid w:val="00FC693F"/>
     <w:rPr>
-      <w:rFonts w:ascii="Microsoft YaHei" w:hAnsi="Microsoft YaHei" w:eastAsia="Microsoft YaHei"/>
-      <w:sz w:val="17"/>
+      <w:rFonts w:ascii="Microsoft YaHei" w:hAnsi="Microsoft YaHei"/>
+      <w:sz w:val="18"/>
     </w:rPr>
   </w:style>
   <w:style w:type="paragraph" w:styleId="Header">

</xml_diff>